<commit_message>
Update industry resume content.
EOF

Co-authored-by: Cursor <cursoragent@cursor.com>
</commit_message>
<xml_diff>
--- a/resume_zyrr.docx
+++ b/resume_zyrr.docx
@@ -174,7 +174,15 @@
           <w:sz w:val="22"/>
           <w:szCs w:val="22"/>
         </w:rPr>
-        <w:t xml:space="preserve"> AI-driven design automation for microfluidics and multicellular systems</w:t>
+        <w:t xml:space="preserve"> </w:t>
+      </w:r>
+      <w:r>
+        <w:rPr>
+          <w:rFonts w:hint="eastAsia" w:ascii="Times New Roman" w:hAnsi="Times New Roman" w:eastAsia="宋体" w:cs="Times New Roman"/>
+          <w:sz w:val="22"/>
+          <w:szCs w:val="22"/>
+        </w:rPr>
+        <w:t>Constraint-Driven Design Automation Frameworks for Microfluidics and Scalable Biological Networks</w:t>
       </w:r>
     </w:p>
     <w:p>
@@ -215,7 +223,23 @@
           <w:sz w:val="22"/>
           <w:szCs w:val="22"/>
         </w:rPr>
-        <w:t xml:space="preserve"> AI-enabled microfluidic CAD, formal verification, and multicellular biological system design.</w:t>
+        <w:t xml:space="preserve"> </w:t>
+      </w:r>
+      <w:r>
+        <w:rPr>
+          <w:rFonts w:hint="eastAsia" w:ascii="Times New Roman" w:hAnsi="Times New Roman" w:eastAsia="宋体" w:cs="Times New Roman"/>
+          <w:sz w:val="22"/>
+          <w:szCs w:val="22"/>
+        </w:rPr>
+        <w:t>AI-driven Design Automation, Graph Algorithms, and Software Infrastructure for Scientific Systems</w:t>
+      </w:r>
+      <w:r>
+        <w:rPr>
+          <w:rFonts w:ascii="Times New Roman" w:hAnsi="Times New Roman" w:eastAsia="宋体" w:cs="Times New Roman"/>
+          <w:sz w:val="22"/>
+          <w:szCs w:val="22"/>
+        </w:rPr>
+        <w:t>.</w:t>
       </w:r>
     </w:p>
     <w:p>
@@ -400,7 +424,52 @@
           <w:rFonts w:hint="eastAsia" w:ascii="Times New Roman" w:hAnsi="Times New Roman" w:cs="Times New Roman"/>
           <w:sz w:val="24"/>
         </w:rPr>
-        <w:t>Computer scientist developing algorithms, programming languages, and AI-driven software infrastructures for biological engineering. My research focuses on translating complex biological design problems into computational abstractions that enable optimization, automation, and scalable scientific discovery.</w:t>
+        <w:t xml:space="preserve">Ph.D. in Computer Engineering with expertise in machine learning, graph algorithms, optimization, and </w:t>
+      </w:r>
+      <w:r>
+        <w:rPr>
+          <w:rFonts w:hint="default" w:ascii="Times New Roman" w:hAnsi="Times New Roman" w:cs="Times New Roman"/>
+          <w:sz w:val="24"/>
+          <w:lang w:val="en-US"/>
+        </w:rPr>
+        <w:t>Machine Learning</w:t>
+      </w:r>
+      <w:r>
+        <w:rPr>
+          <w:rFonts w:hint="eastAsia" w:ascii="Times New Roman" w:hAnsi="Times New Roman" w:cs="Times New Roman"/>
+          <w:sz w:val="24"/>
+        </w:rPr>
+        <w:t xml:space="preserve"> systems. Experienced in developing scalable software infrastructures, intelligent design automation systems, and </w:t>
+      </w:r>
+      <w:r>
+        <w:rPr>
+          <w:rFonts w:hint="default" w:ascii="Times New Roman" w:hAnsi="Times New Roman" w:cs="Times New Roman"/>
+          <w:sz w:val="24"/>
+          <w:lang w:val="en-US"/>
+        </w:rPr>
+        <w:t>ML</w:t>
+      </w:r>
+      <w:r>
+        <w:rPr>
+          <w:rFonts w:hint="eastAsia" w:ascii="Times New Roman" w:hAnsi="Times New Roman" w:cs="Times New Roman"/>
+          <w:sz w:val="24"/>
+        </w:rPr>
+        <w:t xml:space="preserve">-powered applications. Strong background in Python, C++, algorithm design, and deploying </w:t>
+      </w:r>
+      <w:r>
+        <w:rPr>
+          <w:rFonts w:hint="default" w:ascii="Times New Roman" w:hAnsi="Times New Roman" w:cs="Times New Roman"/>
+          <w:sz w:val="24"/>
+          <w:lang w:val="en-US"/>
+        </w:rPr>
+        <w:t>ML</w:t>
+      </w:r>
+      <w:r>
+        <w:rPr>
+          <w:rFonts w:hint="eastAsia" w:ascii="Times New Roman" w:hAnsi="Times New Roman" w:cs="Times New Roman"/>
+          <w:sz w:val="24"/>
+        </w:rPr>
+        <w:t xml:space="preserve"> techniques to solve large-scale optimization problems.</w:t>
       </w:r>
       <w:r>
         <w:rPr>
@@ -1018,97 +1087,98 @@
           <w:szCs w:val="22"/>
           <w:lang w:val="en-US"/>
         </w:rPr>
-        <w:t>Algorithm Design, Graph Algorithms, Constraint Formalization, Scientific Software Engineering, Formal Verification, Optimization, Compiler &amp; DSL Design, AI-assisted Scientific Computing</w:t>
-      </w:r>
-    </w:p>
-    <w:p>
-      <w:pPr>
-        <w:rPr>
-          <w:rFonts w:ascii="Times New Roman" w:hAnsi="Times New Roman" w:cs="Times New Roman"/>
-          <w:b/>
-          <w:bCs/>
-        </w:rPr>
-      </w:pPr>
-      <w:r>
-        <w:rPr>
-          <w:rFonts w:ascii="Times New Roman" w:hAnsi="Times New Roman" w:eastAsia="宋体" w:cs="Times New Roman"/>
-          <w:b/>
-          <w:bCs/>
-          <w:sz w:val="22"/>
-          <w:szCs w:val="22"/>
-        </w:rPr>
-        <w:t xml:space="preserve">AI &amp; Data Science: </w:t>
-      </w:r>
-      <w:r>
-        <w:rPr>
-          <w:rFonts w:ascii="Times New Roman" w:hAnsi="Times New Roman" w:eastAsia="宋体" w:cs="Times New Roman"/>
-          <w:sz w:val="22"/>
-          <w:szCs w:val="22"/>
-        </w:rPr>
-        <w:t>Graph Algorithm Library (NetworkX),</w:t>
-      </w:r>
-      <w:r>
-        <w:rPr>
-          <w:rFonts w:ascii="Times New Roman" w:hAnsi="Times New Roman" w:cs="Times New Roman"/>
-        </w:rPr>
-        <w:t xml:space="preserve"> ML/AI/DS Library (</w:t>
-      </w:r>
-      <w:r>
-        <w:rPr>
-          <w:rFonts w:ascii="Times New Roman" w:hAnsi="Times New Roman" w:eastAsia="宋体" w:cs="Times New Roman"/>
-          <w:sz w:val="22"/>
-          <w:szCs w:val="22"/>
-        </w:rPr>
-        <w:t>PyTorch, TensorFlow, NumPy)</w:t>
-      </w:r>
-    </w:p>
-    <w:p>
-      <w:pPr>
-        <w:rPr>
-          <w:rFonts w:ascii="Times New Roman" w:hAnsi="Times New Roman" w:eastAsia="宋体" w:cs="Times New Roman"/>
-          <w:b/>
-          <w:bCs/>
-          <w:sz w:val="22"/>
-          <w:szCs w:val="22"/>
-        </w:rPr>
-      </w:pPr>
-      <w:r>
-        <w:rPr>
-          <w:rFonts w:ascii="Times New Roman" w:hAnsi="Times New Roman" w:eastAsia="宋体" w:cs="Times New Roman"/>
-          <w:b/>
-          <w:bCs/>
-          <w:sz w:val="22"/>
-          <w:szCs w:val="22"/>
-        </w:rPr>
-        <w:t>Systems &amp; Software:</w:t>
-      </w:r>
-      <w:r>
-        <w:rPr>
-          <w:rFonts w:ascii="Times New Roman" w:hAnsi="Times New Roman" w:eastAsia="宋体" w:cs="Times New Roman"/>
-          <w:sz w:val="22"/>
-          <w:szCs w:val="22"/>
-        </w:rPr>
-        <w:t xml:space="preserve"> Python, C/C++, Java, TypeScript, </w:t>
-      </w:r>
-      <w:r>
-        <w:rPr>
-          <w:rFonts w:ascii="Times New Roman" w:hAnsi="Times New Roman" w:eastAsia="宋体" w:cs="Times New Roman"/>
-          <w:sz w:val="22"/>
-          <w:szCs w:val="22"/>
-        </w:rPr>
-        <w:tab/>
-      </w:r>
-      <w:r>
-        <w:rPr>
-          <w:rFonts w:ascii="Times New Roman" w:hAnsi="Times New Roman" w:eastAsia="宋体" w:cs="Times New Roman"/>
-          <w:sz w:val="22"/>
-          <w:szCs w:val="22"/>
-        </w:rPr>
-        <w:t>HTML, Linux Shell, LaTeX</w:t>
-      </w:r>
-    </w:p>
-    <w:p>
-      <w:pPr>
+        <w:t>Algorithm Design, Machine Learning, Graph Algorithms, Search, Graph-based Optimization,  Dynamic Programming, Constraint Formalization, Scientific Software Engineering, Formal Verification, Compiler &amp; DSL Design, AI-assisted Scientific Computing, Prompt Engineering</w:t>
+      </w:r>
+    </w:p>
+    <w:p>
+      <w:pPr>
+        <w:rPr>
+          <w:rFonts w:hint="default" w:ascii="Times New Roman" w:hAnsi="Times New Roman" w:cs="Times New Roman"/>
+          <w:b/>
+          <w:bCs/>
+          <w:lang w:val="en-US"/>
+        </w:rPr>
+      </w:pPr>
+      <w:r>
+        <w:rPr>
+          <w:rFonts w:hint="default" w:ascii="Times New Roman" w:hAnsi="Times New Roman" w:eastAsia="宋体" w:cs="Times New Roman"/>
+          <w:b/>
+          <w:bCs/>
+          <w:sz w:val="22"/>
+          <w:szCs w:val="22"/>
+          <w:lang w:val="en-US"/>
+        </w:rPr>
+        <w:t>Machine Learning</w:t>
+      </w:r>
+      <w:r>
+        <w:rPr>
+          <w:rFonts w:ascii="Times New Roman" w:hAnsi="Times New Roman" w:eastAsia="宋体" w:cs="Times New Roman"/>
+          <w:b/>
+          <w:bCs/>
+          <w:sz w:val="22"/>
+          <w:szCs w:val="22"/>
+        </w:rPr>
+        <w:t xml:space="preserve">: </w:t>
+      </w:r>
+      <w:r>
+        <w:rPr>
+          <w:rFonts w:ascii="Times New Roman" w:hAnsi="Times New Roman" w:eastAsia="宋体" w:cs="Times New Roman"/>
+          <w:sz w:val="22"/>
+          <w:szCs w:val="22"/>
+        </w:rPr>
+        <w:t>PyTorch, TensorFlow, NumPy</w:t>
+      </w:r>
+      <w:r>
+        <w:rPr>
+          <w:rFonts w:hint="default" w:ascii="Times New Roman" w:hAnsi="Times New Roman" w:eastAsia="宋体" w:cs="Times New Roman"/>
+          <w:sz w:val="22"/>
+          <w:szCs w:val="22"/>
+          <w:lang w:val="en-US"/>
+        </w:rPr>
+        <w:t>, Scikit-learn</w:t>
+      </w:r>
+    </w:p>
+    <w:p>
+      <w:pPr>
+        <w:rPr>
+          <w:rFonts w:ascii="Times New Roman" w:hAnsi="Times New Roman" w:eastAsia="宋体" w:cs="Times New Roman"/>
+          <w:sz w:val="22"/>
+          <w:szCs w:val="22"/>
+        </w:rPr>
+      </w:pPr>
+      <w:r>
+        <w:rPr>
+          <w:rFonts w:hint="default" w:ascii="Times New Roman" w:hAnsi="Times New Roman" w:eastAsia="宋体" w:cs="Times New Roman"/>
+          <w:b/>
+          <w:bCs/>
+          <w:sz w:val="22"/>
+          <w:szCs w:val="22"/>
+          <w:lang w:val="en-US"/>
+        </w:rPr>
+        <w:t>Programming</w:t>
+      </w:r>
+      <w:r>
+        <w:rPr>
+          <w:rFonts w:ascii="Times New Roman" w:hAnsi="Times New Roman" w:eastAsia="宋体" w:cs="Times New Roman"/>
+          <w:b/>
+          <w:bCs/>
+          <w:sz w:val="22"/>
+          <w:szCs w:val="22"/>
+        </w:rPr>
+        <w:t>:</w:t>
+      </w:r>
+      <w:r>
+        <w:rPr>
+          <w:rFonts w:ascii="Times New Roman" w:hAnsi="Times New Roman" w:eastAsia="宋体" w:cs="Times New Roman"/>
+          <w:sz w:val="22"/>
+          <w:szCs w:val="22"/>
+        </w:rPr>
+        <w:t xml:space="preserve"> Python, C/C++, Java, TypeScript, HTML, Linux Shell, LaTeX</w:t>
+      </w:r>
+    </w:p>
+    <w:p>
+      <w:pPr>
+        <w:spacing w:after="200"/>
         <w:rPr>
           <w:rFonts w:ascii="Times New Roman" w:hAnsi="Times New Roman" w:eastAsia="宋体" w:cs="Times New Roman"/>
           <w:sz w:val="22"/>
@@ -1151,35 +1221,7 @@
           <w:sz w:val="22"/>
           <w:szCs w:val="22"/>
         </w:rPr>
-        <w:t xml:space="preserve"> CNC Milling, Laser Cutting, Benchmark Collection and Evaluation</w:t>
-      </w:r>
-    </w:p>
-    <w:p>
-      <w:pPr>
-        <w:spacing w:after="200"/>
-        <w:rPr>
-          <w:rFonts w:ascii="Times New Roman" w:hAnsi="Times New Roman" w:eastAsia="宋体" w:cs="Times New Roman"/>
-          <w:sz w:val="22"/>
-          <w:szCs w:val="22"/>
-        </w:rPr>
-      </w:pPr>
-      <w:r>
-        <w:rPr>
-          <w:rFonts w:ascii="Times New Roman" w:hAnsi="Times New Roman" w:eastAsia="宋体" w:cs="Times New Roman"/>
-          <w:b/>
-          <w:bCs/>
-          <w:sz w:val="22"/>
-          <w:szCs w:val="22"/>
-        </w:rPr>
-        <w:t>CAD Tools:</w:t>
-      </w:r>
-      <w:r>
-        <w:rPr>
-          <w:rFonts w:ascii="Times New Roman" w:hAnsi="Times New Roman" w:eastAsia="宋体" w:cs="Times New Roman"/>
-          <w:sz w:val="22"/>
-          <w:szCs w:val="22"/>
-        </w:rPr>
-        <w:t xml:space="preserve"> Fusion 360, Microfluidic Devices Manual Design</w:t>
+        <w:t xml:space="preserve"> CNC Milling, Laser Cutting, Fusion 360, Microfluidic Devices Manual Design</w:t>
       </w:r>
     </w:p>
     <w:p>
@@ -1296,7 +1338,27 @@
           <w:sz w:val="22"/>
           <w:szCs w:val="28"/>
         </w:rPr>
-        <w:t xml:space="preserve">Neptune — Hierarchical Microfluidic Design Automation System </w:t>
+        <w:t xml:space="preserve">Neptune — </w:t>
+      </w:r>
+      <w:r>
+        <w:rPr>
+          <w:rFonts w:hint="eastAsia" w:ascii="Times New Roman" w:hAnsi="Times New Roman" w:cs="Times New Roman"/>
+          <w:b/>
+          <w:bCs/>
+          <w:sz w:val="22"/>
+          <w:szCs w:val="28"/>
+        </w:rPr>
+        <w:t>AI-powered</w:t>
+      </w:r>
+      <w:r>
+        <w:rPr>
+          <w:rFonts w:ascii="Times New Roman" w:hAnsi="Times New Roman" w:cs="Times New Roman"/>
+          <w:b/>
+          <w:bCs/>
+          <w:sz w:val="22"/>
+          <w:szCs w:val="28"/>
+        </w:rPr>
+        <w:t xml:space="preserve"> Microfluidic Design Automation System </w:t>
       </w:r>
       <w:r>
         <w:rPr>
@@ -1331,7 +1393,7 @@
           <w:sz w:val="22"/>
           <w:szCs w:val="28"/>
         </w:rPr>
-        <w:t>Designed a domain-specific programming language (DSL) and compiler enabling AI-assisted biological design.</w:t>
+        <w:t>Developed a scalable software infrastructure for automated design workflows.</w:t>
       </w:r>
     </w:p>
     <w:p>
@@ -1354,7 +1416,7 @@
           <w:sz w:val="22"/>
           <w:szCs w:val="28"/>
         </w:rPr>
-        <w:t>Developed graph-based intermediate representations supporting automated optimization.</w:t>
+        <w:t>Designed compiler pipelines and graph-based intermediate representations.</w:t>
       </w:r>
     </w:p>
     <w:p>
@@ -1377,7 +1439,30 @@
           <w:sz w:val="22"/>
           <w:szCs w:val="28"/>
         </w:rPr>
-        <w:t xml:space="preserve">Built an extensible software infrastructure for end-to-end scientific design automation. </w:t>
+        <w:t>Implemented optimization frameworks supporting large-scale workflow automation.</w:t>
+      </w:r>
+    </w:p>
+    <w:p>
+      <w:pPr>
+        <w:pStyle w:val="11"/>
+        <w:numPr>
+          <w:ilvl w:val="0"/>
+          <w:numId w:val="2"/>
+        </w:numPr>
+        <w:ind w:firstLineChars="0"/>
+        <w:rPr>
+          <w:rFonts w:hint="eastAsia" w:ascii="Times New Roman" w:hAnsi="Times New Roman" w:cs="Times New Roman"/>
+          <w:sz w:val="22"/>
+          <w:szCs w:val="28"/>
+        </w:rPr>
+      </w:pPr>
+      <w:r>
+        <w:rPr>
+          <w:rFonts w:hint="eastAsia" w:ascii="Times New Roman" w:hAnsi="Times New Roman" w:cs="Times New Roman"/>
+          <w:sz w:val="22"/>
+          <w:szCs w:val="28"/>
+        </w:rPr>
+        <w:t xml:space="preserve">Built modular software architecture supporting future extensibility. </w:t>
       </w:r>
     </w:p>
     <w:p>
@@ -1402,7 +1487,38 @@
           <w:sz w:val="22"/>
           <w:szCs w:val="28"/>
         </w:rPr>
-        <w:t xml:space="preserve">Oriole — Genetic Circuit Partitioning for Multicellular Computation </w:t>
+        <w:t xml:space="preserve">Oriole — </w:t>
+      </w:r>
+      <w:r>
+        <w:rPr>
+          <w:rFonts w:hint="eastAsia" w:ascii="Times New Roman" w:hAnsi="Times New Roman" w:cs="Times New Roman"/>
+          <w:b/>
+          <w:bCs/>
+          <w:sz w:val="22"/>
+          <w:szCs w:val="28"/>
+        </w:rPr>
+        <w:t>Graph Optimization Framework</w:t>
+      </w:r>
+      <w:r>
+        <w:rPr>
+          <w:rFonts w:ascii="Times New Roman" w:hAnsi="Times New Roman" w:cs="Times New Roman"/>
+          <w:b/>
+          <w:bCs/>
+          <w:sz w:val="22"/>
+          <w:szCs w:val="28"/>
+        </w:rPr>
+        <w:t xml:space="preserve"> </w:t>
+      </w:r>
+      <w:r>
+        <w:rPr>
+          <w:rFonts w:hint="default" w:ascii="Times New Roman" w:hAnsi="Times New Roman" w:cs="Times New Roman"/>
+          <w:b/>
+          <w:bCs/>
+          <w:sz w:val="22"/>
+          <w:szCs w:val="28"/>
+          <w:lang w:val="en-US"/>
+        </w:rPr>
+        <w:t xml:space="preserve">for Large-scale Biological Computation </w:t>
       </w:r>
       <w:r>
         <w:rPr>
@@ -1434,18 +1550,18 @@
         </w:numPr>
         <w:ind w:firstLineChars="0"/>
         <w:rPr>
-          <w:rFonts w:ascii="Times New Roman" w:hAnsi="Times New Roman" w:cs="Times New Roman"/>
-          <w:sz w:val="22"/>
-          <w:szCs w:val="28"/>
-        </w:rPr>
-      </w:pPr>
-      <w:r>
-        <w:rPr>
           <w:rFonts w:hint="eastAsia" w:ascii="Times New Roman" w:hAnsi="Times New Roman" w:cs="Times New Roman"/>
           <w:sz w:val="22"/>
           <w:szCs w:val="28"/>
         </w:rPr>
-        <w:t>Developed a constraint-based graph partitioning algorithm for multicellular computation under biological and hardware constraints.</w:t>
+      </w:pPr>
+      <w:r>
+        <w:rPr>
+          <w:rFonts w:hint="eastAsia" w:ascii="Times New Roman" w:hAnsi="Times New Roman" w:cs="Times New Roman"/>
+          <w:sz w:val="22"/>
+          <w:szCs w:val="28"/>
+        </w:rPr>
+        <w:t>Designed scalable graph optimization framework.</w:t>
       </w:r>
     </w:p>
     <w:p>
@@ -1457,18 +1573,41 @@
         </w:numPr>
         <w:ind w:firstLineChars="0"/>
         <w:rPr>
-          <w:rFonts w:ascii="Times New Roman" w:hAnsi="Times New Roman" w:cs="Times New Roman"/>
-          <w:sz w:val="22"/>
-          <w:szCs w:val="28"/>
-        </w:rPr>
-      </w:pPr>
-      <w:r>
-        <w:rPr>
           <w:rFonts w:hint="eastAsia" w:ascii="Times New Roman" w:hAnsi="Times New Roman" w:cs="Times New Roman"/>
           <w:sz w:val="22"/>
           <w:szCs w:val="28"/>
         </w:rPr>
-        <w:t>Formalized biological and experimental constraints into computational representations, enabling automated genetic circuit synthesis and optimization.</w:t>
+      </w:pPr>
+      <w:r>
+        <w:rPr>
+          <w:rFonts w:hint="eastAsia" w:ascii="Times New Roman" w:hAnsi="Times New Roman" w:cs="Times New Roman"/>
+          <w:sz w:val="22"/>
+          <w:szCs w:val="28"/>
+        </w:rPr>
+        <w:t>Implemented efficient graph partitioning algorithms.</w:t>
+      </w:r>
+    </w:p>
+    <w:p>
+      <w:pPr>
+        <w:pStyle w:val="11"/>
+        <w:numPr>
+          <w:ilvl w:val="0"/>
+          <w:numId w:val="2"/>
+        </w:numPr>
+        <w:ind w:firstLineChars="0"/>
+        <w:rPr>
+          <w:rFonts w:ascii="Times New Roman" w:hAnsi="Times New Roman" w:cs="Times New Roman"/>
+          <w:sz w:val="22"/>
+          <w:szCs w:val="28"/>
+        </w:rPr>
+      </w:pPr>
+      <w:r>
+        <w:rPr>
+          <w:rFonts w:hint="eastAsia" w:ascii="Times New Roman" w:hAnsi="Times New Roman" w:cs="Times New Roman"/>
+          <w:sz w:val="22"/>
+          <w:szCs w:val="28"/>
+        </w:rPr>
+        <w:t>Built reusable optimization library.</w:t>
       </w:r>
     </w:p>
     <w:p>
@@ -1493,7 +1632,7 @@
           <w:sz w:val="22"/>
           <w:szCs w:val="28"/>
         </w:rPr>
-        <w:t xml:space="preserve">Vespa — In-silico Logic-level </w:t>
+        <w:t xml:space="preserve">Vespa — </w:t>
       </w:r>
       <w:r>
         <w:rPr>
@@ -1503,17 +1642,17 @@
           <w:sz w:val="22"/>
           <w:szCs w:val="28"/>
         </w:rPr>
-        <w:t>C</w:t>
-      </w:r>
-      <w:r>
-        <w:rPr>
-          <w:rFonts w:ascii="Times New Roman" w:hAnsi="Times New Roman" w:cs="Times New Roman"/>
-          <w:b/>
-          <w:bCs/>
-          <w:sz w:val="22"/>
-          <w:szCs w:val="28"/>
-        </w:rPr>
-        <w:t xml:space="preserve">onstraint-based </w:t>
+        <w:t>L</w:t>
+      </w:r>
+      <w:r>
+        <w:rPr>
+          <w:rFonts w:ascii="Times New Roman" w:hAnsi="Times New Roman" w:cs="Times New Roman"/>
+          <w:b/>
+          <w:bCs/>
+          <w:sz w:val="22"/>
+          <w:szCs w:val="28"/>
+        </w:rPr>
+        <w:t xml:space="preserve">arge-scale </w:t>
       </w:r>
       <w:r>
         <w:rPr>
@@ -1523,37 +1662,18 @@
           <w:sz w:val="22"/>
           <w:szCs w:val="28"/>
         </w:rPr>
-        <w:t>V</w:t>
-      </w:r>
-      <w:r>
-        <w:rPr>
-          <w:rFonts w:ascii="Times New Roman" w:hAnsi="Times New Roman" w:cs="Times New Roman"/>
-          <w:b/>
-          <w:bCs/>
-          <w:sz w:val="22"/>
-          <w:szCs w:val="28"/>
-        </w:rPr>
-        <w:t xml:space="preserve">alidation for </w:t>
-      </w:r>
-      <w:r>
-        <w:rPr>
-          <w:rFonts w:hint="eastAsia" w:ascii="Times New Roman" w:hAnsi="Times New Roman" w:cs="Times New Roman"/>
-          <w:b/>
-          <w:bCs/>
-          <w:sz w:val="22"/>
-          <w:szCs w:val="28"/>
-        </w:rPr>
-        <w:t>L</w:t>
-      </w:r>
-      <w:r>
-        <w:rPr>
-          <w:rFonts w:ascii="Times New Roman" w:hAnsi="Times New Roman" w:cs="Times New Roman"/>
-          <w:b/>
-          <w:bCs/>
-          <w:sz w:val="22"/>
-          <w:szCs w:val="28"/>
-        </w:rPr>
-        <w:t xml:space="preserve">arge-scale </w:t>
+        <w:t xml:space="preserve">Automated Verification </w:t>
+      </w:r>
+      <w:r>
+        <w:rPr>
+          <w:rFonts w:hint="default" w:ascii="Times New Roman" w:hAnsi="Times New Roman" w:cs="Times New Roman"/>
+          <w:b/>
+          <w:bCs/>
+          <w:sz w:val="22"/>
+          <w:szCs w:val="28"/>
+          <w:lang w:val="en-US"/>
+        </w:rPr>
+        <w:t xml:space="preserve">for </w:t>
       </w:r>
       <w:r>
         <w:rPr>
@@ -1610,13 +1730,15 @@
           <w:szCs w:val="28"/>
         </w:rPr>
       </w:pPr>
-      <w:r>
-        <w:rPr>
-          <w:rFonts w:ascii="Times New Roman" w:hAnsi="Times New Roman" w:cs="Times New Roman"/>
-          <w:sz w:val="22"/>
-          <w:szCs w:val="28"/>
-        </w:rPr>
-        <w:t xml:space="preserve">Developed an automated in-silico validation system for microfluidic workflows, enabling simulation-based verification and reliability testing prior to wet-lab execution. </w:t>
+      <w:bookmarkStart w:id="2" w:name="_GoBack"/>
+      <w:bookmarkEnd w:id="2"/>
+      <w:r>
+        <w:rPr>
+          <w:rFonts w:hint="eastAsia" w:ascii="Times New Roman" w:hAnsi="Times New Roman" w:cs="Times New Roman"/>
+          <w:sz w:val="22"/>
+          <w:szCs w:val="28"/>
+        </w:rPr>
+        <w:t>Developed an automated software verification framework.</w:t>
       </w:r>
     </w:p>
     <w:p>
@@ -1635,45 +1757,51 @@
       </w:pPr>
       <w:r>
         <w:rPr>
-          <w:rFonts w:ascii="Times New Roman" w:hAnsi="Times New Roman" w:cs="Times New Roman"/>
-          <w:sz w:val="22"/>
-          <w:szCs w:val="28"/>
-        </w:rPr>
-        <w:t xml:space="preserve">Constructed benchmark datasets for </w:t>
-      </w:r>
-      <w:r>
-        <w:rPr>
           <w:rFonts w:hint="eastAsia" w:ascii="Times New Roman" w:hAnsi="Times New Roman" w:cs="Times New Roman"/>
           <w:sz w:val="22"/>
           <w:szCs w:val="28"/>
-          <w:lang w:val="en-US" w:eastAsia="zh-CN"/>
-        </w:rPr>
-        <w:t xml:space="preserve">future standardized </w:t>
-      </w:r>
-      <w:r>
-        <w:rPr>
-          <w:rFonts w:ascii="Times New Roman" w:hAnsi="Times New Roman" w:cs="Times New Roman"/>
-          <w:sz w:val="22"/>
-          <w:szCs w:val="28"/>
-        </w:rPr>
-        <w:t>evaluat</w:t>
-      </w:r>
+        </w:rPr>
+        <w:t>Built scalable benchmark datasets</w:t>
+      </w:r>
+      <w:r>
+        <w:rPr>
+          <w:rFonts w:hint="default" w:ascii="Times New Roman" w:hAnsi="Times New Roman" w:cs="Times New Roman"/>
+          <w:sz w:val="22"/>
+          <w:szCs w:val="28"/>
+          <w:lang w:val="en-US"/>
+        </w:rPr>
+        <w:t xml:space="preserve"> with standard evaluation metrics</w:t>
+      </w:r>
+      <w:r>
+        <w:rPr>
+          <w:rFonts w:ascii="Times New Roman" w:hAnsi="Times New Roman" w:cs="Times New Roman"/>
+          <w:sz w:val="22"/>
+          <w:szCs w:val="28"/>
+        </w:rPr>
+        <w:t xml:space="preserve">. </w:t>
+      </w:r>
+    </w:p>
+    <w:p>
+      <w:pPr>
+        <w:pStyle w:val="11"/>
+        <w:numPr>
+          <w:ilvl w:val="0"/>
+          <w:numId w:val="3"/>
+        </w:numPr>
+        <w:ind w:firstLineChars="0"/>
+        <w:rPr>
+          <w:rFonts w:ascii="Times New Roman" w:hAnsi="Times New Roman" w:cs="Times New Roman"/>
+          <w:sz w:val="22"/>
+          <w:szCs w:val="28"/>
+        </w:rPr>
+      </w:pPr>
       <w:r>
         <w:rPr>
           <w:rFonts w:hint="eastAsia" w:ascii="Times New Roman" w:hAnsi="Times New Roman" w:cs="Times New Roman"/>
           <w:sz w:val="22"/>
           <w:szCs w:val="28"/>
-          <w:lang w:val="en-US" w:eastAsia="zh-CN"/>
-        </w:rPr>
-        <w:t>ion</w:t>
-      </w:r>
-      <w:r>
-        <w:rPr>
-          <w:rFonts w:ascii="Times New Roman" w:hAnsi="Times New Roman" w:cs="Times New Roman"/>
-          <w:sz w:val="22"/>
-          <w:szCs w:val="28"/>
-        </w:rPr>
-        <w:t>.</w:t>
+        </w:rPr>
+        <w:t>Designed graph-based simulation pipelines.</w:t>
       </w:r>
     </w:p>
     <w:p>
@@ -1743,11 +1871,37 @@
       </w:pPr>
       <w:r>
         <w:rPr>
-          <w:rFonts w:ascii="Times New Roman" w:hAnsi="Times New Roman" w:cs="Times New Roman"/>
-          <w:sz w:val="22"/>
-          <w:szCs w:val="28"/>
-        </w:rPr>
-        <w:t>Built a natural language interface using large language models (Claude, GPT, Gemini, Qwen, DeepSeek) enabling users to interact with microfluidic design workflows without programming.</w:t>
+          <w:rFonts w:hint="eastAsia" w:ascii="Times New Roman" w:hAnsi="Times New Roman" w:cs="Times New Roman"/>
+          <w:sz w:val="22"/>
+          <w:szCs w:val="28"/>
+        </w:rPr>
+        <w:t>Integrated GPT-4, Claude, Gemini, DeepSeek, and Qwen into an intelligent</w:t>
+      </w:r>
+      <w:r>
+        <w:rPr>
+          <w:rFonts w:hint="default" w:ascii="Times New Roman" w:hAnsi="Times New Roman" w:cs="Times New Roman"/>
+          <w:sz w:val="22"/>
+          <w:szCs w:val="28"/>
+          <w:lang w:val="en-US"/>
+        </w:rPr>
+        <w:t xml:space="preserve"> microfluidic</w:t>
+      </w:r>
+      <w:r>
+        <w:rPr>
+          <w:rFonts w:hint="eastAsia" w:ascii="Times New Roman" w:hAnsi="Times New Roman" w:cs="Times New Roman"/>
+          <w:sz w:val="22"/>
+          <w:szCs w:val="28"/>
+        </w:rPr>
+        <w:t xml:space="preserve"> design workflow.</w:t>
+      </w:r>
+      <w:r>
+        <w:rPr>
+          <w:rFonts w:hint="default" w:ascii="Times New Roman" w:hAnsi="Times New Roman" w:cs="Times New Roman"/>
+          <w:sz w:val="22"/>
+          <w:szCs w:val="28"/>
+          <w:lang w:val="en-US"/>
+        </w:rPr>
+        <w:t xml:space="preserve"> Developed prompt engineering strategies for automated code generation. Built natural language interfaces enabling automated reasoning.</w:t>
       </w:r>
     </w:p>
     <w:p>
@@ -2462,19 +2616,7 @@
           <w:sz w:val="22"/>
           <w:szCs w:val="22"/>
         </w:rPr>
-        <w:t>EC504: Advanced Data Structures and Algo</w:t>
-      </w:r>
-      <w:bookmarkStart w:id="2" w:name="_GoBack"/>
-      <w:bookmarkEnd w:id="2"/>
-      <w:r>
-        <w:rPr>
-          <w:rFonts w:ascii="Times New Roman" w:hAnsi="Times New Roman" w:cs="Times New Roman"/>
-          <w:b/>
-          <w:bCs/>
-          <w:sz w:val="22"/>
-          <w:szCs w:val="22"/>
-        </w:rPr>
-        <w:t>rithms</w:t>
+        <w:t>EC504: Advanced Data Structures and Algorithms</w:t>
       </w:r>
       <w:r>
         <w:rPr>
@@ -3751,7 +3893,7 @@
   <w:docDefaults>
     <w:rPrDefault>
       <w:rPr>
-        <w:rFonts w:asciiTheme="minorHAnsi" w:hAnsiTheme="minorHAnsi" w:eastAsiaTheme="minorEastAsia" w:cstheme="minorBidi"/>
+        <w:rFonts w:ascii="Times New Roman" w:hAnsi="Times New Roman" w:eastAsia="宋体" w:cs="Times New Roman"/>
       </w:rPr>
     </w:rPrDefault>
     <w:pPrDefault/>

</xml_diff>